<commit_message>
Add portfolio website project to CV
</commit_message>
<xml_diff>
--- a/assets/documents/Muhammad_Zarul_Aziri_Internship_CV_Corrected.docx
+++ b/assets/documents/Muhammad_Zarul_Aziri_Internship_CV_Corrected.docx
@@ -695,6 +695,75 @@
       </w:pPr>
       <w:r>
         <w:t>Maintained both a browser-first Next.js application and an Expo/React Native foundation for future cross-platform mobile or desktop delivery.</w:t>
+      </w:r>
+    </w:p>
+    <w:p>
+      <w:pPr>
+        <w:pStyle w:val="CVRole"/>
+        <w:keepNext/>
+        <w:pageBreakBefore w:val="0"/>
+        <w:spacing w:line="360" w:lineRule="auto" w:before="40" w:after="0"/>
+        <w:jc w:val="both"/>
+      </w:pPr>
+      <w:r>
+        <w:rPr>
+          <w:b/>
+          <w:sz w:val="20"/>
+        </w:rPr>
+        <w:t>Portfolio Website - Personal Developer Portfolio | Jun 2026</w:t>
+      </w:r>
+    </w:p>
+    <w:p>
+      <w:pPr>
+        <w:pStyle w:val="CVMeta"/>
+        <w:keepNext/>
+        <w:pageBreakBefore w:val="0"/>
+        <w:spacing w:line="360" w:lineRule="auto" w:before="0" w:after="0"/>
+        <w:jc w:val="both"/>
+      </w:pPr>
+      <w:r>
+        <w:rPr>
+          <w:i/>
+          <w:color w:val="555E67"/>
+          <w:sz w:val="18"/>
+        </w:rPr>
+        <w:t xml:space="preserve">HTML5, CSS3, JavaScript, GitHub Pages | Portfolio: </w:t>
+      </w:r>
+      <w:hyperlink r:id="rId19">
+        <w:r>
+          <w:rPr>
+            <w:i/>
+            <w:color w:val="555E67"/>
+            <w:sz w:val="18"/>
+            <w:color w:val="0563C1"/>
+            <w:u w:val="single"/>
+          </w:rPr>
+          <w:t>https://zarul47945.github.io/</w:t>
+        </w:r>
+      </w:hyperlink>
+    </w:p>
+    <w:p>
+      <w:pPr>
+        <w:pStyle w:val="CVBullet"/>
+        <w:keepLines/>
+        <w:pageBreakBefore w:val="0"/>
+        <w:spacing w:line="360" w:lineRule="auto" w:before="0" w:after="0"/>
+        <w:jc w:val="both"/>
+      </w:pPr>
+      <w:r>
+        <w:t>Designed and deployed a responsive five-section portfolio website covering About Me, Experience, Projects, Extracurricular &amp; Community Engagement, and Contact.</w:t>
+      </w:r>
+    </w:p>
+    <w:p>
+      <w:pPr>
+        <w:pStyle w:val="CVBullet"/>
+        <w:keepLines/>
+        <w:pageBreakBefore w:val="0"/>
+        <w:spacing w:line="360" w:lineRule="auto" w:before="0" w:after="0"/>
+        <w:jc w:val="both"/>
+      </w:pPr>
+      <w:r>
+        <w:t>Built dedicated detail pages for projects, work experiences, and community engagement with clickable image galleries, mobile-friendly layout, and downloadable CV access.</w:t>
       </w:r>
     </w:p>
     <w:p>
@@ -1458,6 +1527,10 @@
         </w:tc>
       </w:tr>
     </w:tbl>
+    <w:p/>
+    <w:p/>
+    <w:p/>
+    <w:p/>
     <w:sectPr>
       <w:footerReference w:type="default" r:id="rId16"/>
       <w:pgSz w:w="11906" w:h="16838"/>

</xml_diff>